<commit_message>
feat: add document generation and management features
- Introduced new types for generated documents in the DealsPage component to manage agreements and receipts.
- Implemented functions for generating and downloading contracts and receipts, enhancing document handling capabilities.
- Updated package dependencies to include docxtemplater and pizzip for document generation.
- Modified PLACEHOLDERS.md to clarify syntax for conditional placeholders in document templates.
- Updated binary contract templates to reflect recent changes in document structure.
</commit_message>
<xml_diff>
--- a/templates/contracts/payment_receipt.docx
+++ b/templates/contracts/payment_receipt.docx
@@ -361,34 +361,40 @@
 <file path=word/footer1.xml><?xml version="1.0" encoding="utf-8"?>
 <w:ftr xmlns:m="http://schemas.openxmlformats.org/officeDocument/2006/math" xmlns:mc="http://schemas.openxmlformats.org/markup-compatibility/2006" xmlns:mo="http://schemas.microsoft.com/office/mac/office/2008/main" xmlns:mv="urn:schemas-microsoft-com:mac:vml" xmlns:o="urn:schemas-microsoft-com:office:office" xmlns:r="http://schemas.openxmlformats.org/officeDocument/2006/relationships" xmlns:v="urn:schemas-microsoft-com:vml" xmlns:w10="urn:schemas-microsoft-com:office:word" xmlns:w14="http://schemas.microsoft.com/office/word/2010/wordml" xmlns:w="http://schemas.openxmlformats.org/wordprocessingml/2006/main" xmlns:wne="http://schemas.microsoft.com/office/word/2006/wordml" xmlns:wp14="http://schemas.microsoft.com/office/word/2010/wordprocessingDrawing" xmlns:wp="http://schemas.openxmlformats.org/drawingml/2006/wordprocessingDrawing" xmlns:wpc="http://schemas.microsoft.com/office/word/2010/wordprocessingCanvas" xmlns:wpg="http://schemas.microsoft.com/office/word/2010/wordprocessingGroup" xmlns:wpi="http://schemas.microsoft.com/office/word/2010/wordprocessingInk" xmlns:wps="http://schemas.microsoft.com/office/word/2010/wordprocessingShape" mc:Ignorable="w14 wp14">
   <w:p>
-    <w:pPr>
-      <w:pStyle w:val="Footer"/>
-      <w:jc w:val="center"/>
-    </w:pPr>
     <w:r>
-      <w:rPr>
-        <w:rFonts w:ascii="Calibri" w:hAnsi="Calibri"/>
-        <w:b w:val="0"/>
-        <w:sz w:val="20"/>
-      </w:rPr>
       <w:t xml:space="preserve">Page </w:t>
     </w:r>
     <w:r>
       <w:fldChar w:fldCharType="begin"/>
-      <w:instrText xml:space="preserve">PAGE</w:instrText>
+    </w:r>
+    <w:r>
+      <w:instrText xml:space="preserve"> PAGE </w:instrText>
+    </w:r>
+    <w:r>
+      <w:fldChar w:fldCharType="separate"/>
+    </w:r>
+    <w:r>
+      <w:t>1</w:t>
+    </w:r>
+    <w:r>
       <w:fldChar w:fldCharType="end"/>
     </w:r>
     <w:r>
-      <w:rPr>
-        <w:rFonts w:ascii="Calibri" w:hAnsi="Calibri"/>
-        <w:b w:val="0"/>
-        <w:sz w:val="20"/>
-      </w:rPr>
       <w:t xml:space="preserve"> of </w:t>
     </w:r>
     <w:r>
       <w:fldChar w:fldCharType="begin"/>
-      <w:instrText xml:space="preserve">NUMPAGES</w:instrText>
+    </w:r>
+    <w:r>
+      <w:instrText xml:space="preserve"> NUMPAGES </w:instrText>
+    </w:r>
+    <w:r>
+      <w:fldChar w:fldCharType="separate"/>
+    </w:r>
+    <w:r>
+      <w:t>1</w:t>
+    </w:r>
+    <w:r>
       <w:fldChar w:fldCharType="end"/>
     </w:r>
   </w:p>
@@ -432,11 +438,9 @@
           </w:pPr>
           <w:r>
             <w:rPr>
-              <w:rFonts w:ascii="Calibri" w:hAnsi="Calibri"/>
               <w:b/>
-              <w:sz w:val="20"/>
             </w:rPr>
-            <w:t>[ ]</w:t>
+            <w:t>[LOGO AXIRA / شعار أكسيرا]</w:t>
           </w:r>
         </w:p>
         <w:p>
@@ -489,11 +493,9 @@
           </w:pPr>
           <w:r>
             <w:rPr>
-              <w:rFonts w:ascii="Calibri" w:hAnsi="Calibri"/>
               <w:b/>
-              <w:sz w:val="20"/>
             </w:rPr>
-            <w:t>رقم الإيصال / Numéro du reçu: {{receipt_reference}}</w:t>
+            <w:t>Numéro du reçu / رقم الإيصال: {{receipt_reference}}</w:t>
           </w:r>
         </w:p>
         <w:p>
@@ -502,9 +504,7 @@
           </w:pPr>
           <w:r>
             <w:rPr>
-              <w:rFonts w:ascii="Calibri" w:hAnsi="Calibri"/>
               <w:b/>
-              <w:sz w:val="20"/>
             </w:rPr>
             <w:t>Date / التاريخ: {{receipt_date}}</w:t>
           </w:r>

</xml_diff>